<commit_message>
fix+docs: corrige figura SNA truncada e reescreve Resultados Preliminares com tese central
- Auditoria de figuras: sna_constraint_vs_renda.png estava corrompida (sliver
  2400x104) e era embutida no relatorio; replotada do CSV (1425x975, correta).
  Demais ~115 figuras auditadas (scan de tamanho/aspecto + inspecao das
  embutidas/recentes) sem outros casos.
- Resultados Preliminares reescritos em torno de uma TESE CENTRAL (sistema de
  barreiras em camadas — acesso, remuneracao, redes — ancorado no territorio e
  geograficamente heterogeneo), com conectivos narrativos entre subsecoes, maior
  profundidade interpretativa e 6 figuras (cada uma avancando o argumento):
  Oaxaca por variavel, teto de vidro GLMM, SHAP (bairro>diploma), redes/Burt,
  mapa por UF e TOPSIS. Substitui o "dump" de resultados.
- relatorio.docx regenerado com a figura SNA corrigida; PDF 28 paginas.

Co-Authored-By: Claude Opus 4.8 <noreply@anthropic.com>
</commit_message>
<xml_diff>
--- a/Resultados_Preliminares_TCC.docx
+++ b/Resultados_Preliminares_TCC.docx
@@ -291,25 +291,11 @@
     </w:p>
     <w:p>
       <w:pPr>
-        <w:spacing w:before="120"/>
-      </w:pPr>
-      <w:r>
-        <w:rPr>
-          <w:rFonts w:ascii="Times New Roman" w:hAnsi="Times New Roman"/>
-          <w:b/>
-          <w:i/>
-          <w:sz w:val="24"/>
-        </w:rPr>
-        <w:t>Gap salarial e mediação contextual</w:t>
-      </w:r>
-    </w:p>
-    <w:p>
-      <w:pPr>
         <w:ind w:firstLine="709"/>
         <w:jc w:val="both"/>
       </w:pPr>
       <w:r>
-        <w:t>O diferencial salarial racial bruto é expressivo e, no modelo hierárquico, mais da metade dele é mediada pelo contexto de moradia (UPA): a renda média do bairro é o determinante individual mais forte do rendimento — acima da própria escolaridade. A decomposição de Oaxaca-Blinder atribui cerca de 84% do gap a diferenças de dotações e 16% a retornos diferenciais; contudo, as dotações são, elas próprias, produto das barreiras de acesso e da segregação territorial. O ICC de UF no modelo nulo de salário é de 9,8%.</w:t>
+        <w:t>Os resultados preliminares sustentam uma tese central: a desigualdade racial no mercado de trabalho brasileiro não é um evento pontual de contratação, mas um SISTEMA DE BARREIRAS EM CAMADAS — acesso, remuneração e redes — ancorado no território e geograficamente heterogêneo, que persiste mesmo quando se controla a escolaridade e mesmo dentro do Estado. As subseções a seguir percorrem esse sistema: partem da falha da explicação meritocrática, isolam as três camadas que a substituem, demonstram seu caráter sistêmico e, por fim, traduzem o diagnóstico em prescrição.</w:t>
       </w:r>
     </w:p>
     <w:p>
@@ -323,7 +309,7 @@
           <w:i/>
           <w:sz w:val="24"/>
         </w:rPr>
-        <w:t>Barreira de acesso e teto de vidro</w:t>
+        <w:t>A falha da explicação meritocrática</w:t>
       </w:r>
     </w:p>
     <w:p>
@@ -332,7 +318,7 @@
         <w:jc w:val="both"/>
       </w:pPr>
       <w:r>
-        <w:t>O GLMM logístico confirma uma barreira de acesso a ocupações qualificadas: a chance de um trabalhador negro ocupar cargos qualificados é cerca de 31% menor que a de um branco idêntico (OR=0,691; −4,84 p.p.). O teto de vidro se intensifica no topo: o odds ratio de acesso cai de 0,536 (quintil superior de renda) para 0,453 (decil superior) — a barreira é mais alta exatamente onde os prêmios são maiores. O ICC de UPA no GLMM é de 22,2%, sinalizando forte componente territorial do acesso.</w:t>
+        <w:t>Se o rendimento fosse função apenas do capital humano, controlar escolaridade, experiência e jornada deveria dissolver o gap racial — o que não ocorre. A decomposição de Oaxaca-Blinder atribui cerca de 84% do diferencial a diferenças de dotações e apenas 16% a retornos diferenciais. O ponto decisivo, porém, está na COMPOSIÇÃO dessas dotações (Figura 1): os fatores que mais explicam o gap não são educacionais, mas CONTEXTUAIS e OCUPACIONAIS — a proporção de negros na UPA e o acesso a grupos ocupacionais de prestígio. As dotações não são, portanto, mérito neutro: são o produto das barreiras que as subseções seguintes isolam. O capital humano explica pouco; o que importa é onde se nasce e a que ocupações se tem acesso.</w:t>
       </w:r>
     </w:p>
     <w:p>
@@ -342,7 +328,7 @@
       <w:r>
         <w:drawing>
           <wp:inline xmlns:a="http://schemas.openxmlformats.org/drawingml/2006/main" xmlns:pic="http://schemas.openxmlformats.org/drawingml/2006/picture">
-            <wp:extent cx="5760000" cy="2112000"/>
+            <wp:extent cx="5400000" cy="2670889"/>
             <wp:docPr id="1" name="Picture 1"/>
             <wp:cNvGraphicFramePr>
               <a:graphicFrameLocks noChangeAspect="1"/>
@@ -351,7 +337,7 @@
               <a:graphicData uri="http://schemas.openxmlformats.org/drawingml/2006/picture">
                 <pic:pic>
                   <pic:nvPicPr>
-                    <pic:cNvPr id="0" name="glmm_rs_real.png"/>
+                    <pic:cNvPr id="0" name="oaxaca_por_variavel.png"/>
                     <pic:cNvPicPr/>
                   </pic:nvPicPr>
                   <pic:blipFill>
@@ -363,7 +349,7 @@
                   <pic:spPr>
                     <a:xfrm>
                       <a:off x="0" y="0"/>
-                      <a:ext cx="5760000" cy="2112000"/>
+                      <a:ext cx="5400000" cy="2670889"/>
                     </a:xfrm>
                     <a:prstGeom prst="rect"/>
                   </pic:spPr>
@@ -384,7 +370,7 @@
           <w:rFonts w:ascii="Times New Roman" w:hAnsi="Times New Roman"/>
           <w:sz w:val="20"/>
         </w:rPr>
-        <w:t>Figura 1. Random slope do GLMM (lme4): odds ratio de 'negro' por UF em cada desfecho de acesso; a dispersão entre estados indica heterogeneidade geográfica.</w:t>
+        <w:t>Figura 1. Decomposição de Oaxaca-Blinder por variável: o gap vem sobretudo do contexto (proporção de negros na UPA) e da ocupação — não da escolaridade.</w:t>
       </w:r>
     </w:p>
     <w:p>
@@ -398,7 +384,7 @@
           <w:i/>
           <w:sz w:val="24"/>
         </w:rPr>
-        <w:t>Heterogeneidade geográfica e contraste setorial</w:t>
+        <w:t>Camada 1 — A barreira de acesso e o teto de vidro</w:t>
       </w:r>
     </w:p>
     <w:p>
@@ -407,7 +393,7 @@
         <w:jc w:val="both"/>
       </w:pPr>
       <w:r>
-        <w:t>Os modelos de inclinação aleatória rejeitam a hipótese de efeito homogêneo entre estados (p&lt;0,001), tanto para o salário quanto para o acesso: a discriminação é geograficamente heterogênea. No salário, o gap racial entre UFs varia aproximadamente de 19,8% a 2,2%. Um achado relevante emerge do contraste por setor: o setor público ATENUA o gap salarial racial (7,8% no público contra 11,2% no privado) e o homogeneíza entre estados; porém, no ACESSO a ocupações qualificadas, o setor público não atenua a barreira (OR=0,705 no público contra 0,695 no privado). Ou seja, o concurso público equaliza a remuneração de quem entra, mas não a entrada.</w:t>
+        <w:t>A primeira camada é a exclusão da PORTA DE ENTRADA. O GLMM logístico multinível estima que um trabalhador negro idêntico a um branco tem cerca de 31% menos chance de ocupar um cargo qualificado (OR=0,691; −4,84 p.p.). A barreira não é uniforme ao longo da hierarquia: ela se agrava no topo (Figura 2) — o odds ratio de acesso cai de 0,536 no quintil superior de renda para 0,453 no decil superior. É um teto de vidro de ACESSO: quanto mais valiosa a posição, mais opaco o filtro racial. O elevado ICC de UPA (22,2%) já antecipa que essa barreira tem raiz territorial — o fio que conecta as camadas.</w:t>
       </w:r>
     </w:p>
     <w:p>
@@ -417,7 +403,7 @@
       <w:r>
         <w:drawing>
           <wp:inline xmlns:a="http://schemas.openxmlformats.org/drawingml/2006/main" xmlns:pic="http://schemas.openxmlformats.org/drawingml/2006/picture">
-            <wp:extent cx="3960000" cy="4429233"/>
+            <wp:extent cx="5040000" cy="2486159"/>
             <wp:docPr id="2" name="Picture 2"/>
             <wp:cNvGraphicFramePr>
               <a:graphicFrameLocks noChangeAspect="1"/>
@@ -426,7 +412,7 @@
               <a:graphicData uri="http://schemas.openxmlformats.org/drawingml/2006/picture">
                 <pic:pic>
                   <pic:nvPicPr>
-                    <pic:cNvPr id="0" name="mapa_po_regional.png"/>
+                    <pic:cNvPr id="0" name="glmm_glassceil_forest.png"/>
                     <pic:cNvPicPr/>
                   </pic:nvPicPr>
                   <pic:blipFill>
@@ -438,7 +424,7 @@
                   <pic:spPr>
                     <a:xfrm>
                       <a:off x="0" y="0"/>
-                      <a:ext cx="3960000" cy="4429233"/>
+                      <a:ext cx="5040000" cy="2486159"/>
                     </a:xfrm>
                     <a:prstGeom prst="rect"/>
                   </pic:spPr>
@@ -459,7 +445,7 @@
           <w:rFonts w:ascii="Times New Roman" w:hAnsi="Times New Roman"/>
           <w:sz w:val="20"/>
         </w:rPr>
-        <w:t>Figura 2. Penalidade salarial racial por estado (BLUP do random slope): mais escuro = maior desvantagem; estrelas indicam UFs prioritárias para focalização.</w:t>
+        <w:t>Figura 2. GLMM — odds ratios de acesso por desfecho: o gradiente decrescente rumo ao topo da renda caracteriza o teto de vidro de acesso (OR &lt; 1 = barreira).</w:t>
       </w:r>
     </w:p>
     <w:p>
@@ -473,7 +459,7 @@
           <w:i/>
           <w:sz w:val="24"/>
         </w:rPr>
-        <w:t>Gênero e interseccionalidade</w:t>
+        <w:t>Camada 2 — O território como eixo da desigualdade</w:t>
       </w:r>
     </w:p>
     <w:p>
@@ -482,7 +468,59 @@
         <w:jc w:val="both"/>
       </w:pPr>
       <w:r>
-        <w:t>A extensão da inclinação aleatória ao gênero revela um padrão distinto do racial: mulheres têm MAIOR acesso a 'ocupações qualificadas' (OR=2,01), por concentração em profissões credenciadas feminizadas, mas MENOR acesso ao topo da renda (OR no decil superior = 0,522). O teto de vidro de gênero é, portanto, de remuneração, não de categoria ocupacional, e sua heterogeneidade geográfica supera a racial (desvio-padrão entre UFs de 0,064 para gênero contra 0,050 para raça). A correlação negativa entre as duas heterogeneidades (ρ=−0,46) sugere que, nas UFs de maior penalidade racial, a de gênero tende a ser menor.</w:t>
+        <w:t>Por que as dotações são desiguais? A segunda camada responde: pelo LUGAR. No modelo hierárquico, mais da metade do gap salarial é mediada pelo contexto de moradia (UPA), e o aprendizado de máquina confirma-o de forma independente e não-paramétrica: entre todos os preditores do rendimento, a RENDA MÉDIA DO BAIRRO é o mais importante (Figura 3) — acima da escolaridade e de qualquer atributo individual. A raça, isoladamente, tem peso preditivo direto modesto justamente porque opera ATRAVÉS do território: a segregação residencial histórica converte-se em segregação de renda atual. Em uma frase: o bairro prediz mais que o diploma. É esse eixo territorial que dá unidade às demais camadas.</w:t>
+      </w:r>
+    </w:p>
+    <w:p>
+      <w:pPr>
+        <w:jc w:val="center"/>
+      </w:pPr>
+      <w:r>
+        <w:drawing>
+          <wp:inline xmlns:a="http://schemas.openxmlformats.org/drawingml/2006/main" xmlns:pic="http://schemas.openxmlformats.org/drawingml/2006/picture">
+            <wp:extent cx="5040000" cy="3736625"/>
+            <wp:docPr id="3" name="Picture 3"/>
+            <wp:cNvGraphicFramePr>
+              <a:graphicFrameLocks noChangeAspect="1"/>
+            </wp:cNvGraphicFramePr>
+            <a:graphic>
+              <a:graphicData uri="http://schemas.openxmlformats.org/drawingml/2006/picture">
+                <pic:pic>
+                  <pic:nvPicPr>
+                    <pic:cNvPr id="0" name="shap_importance_xgb.png"/>
+                    <pic:cNvPicPr/>
+                  </pic:nvPicPr>
+                  <pic:blipFill>
+                    <a:blip r:embed="rId11"/>
+                    <a:stretch>
+                      <a:fillRect/>
+                    </a:stretch>
+                  </pic:blipFill>
+                  <pic:spPr>
+                    <a:xfrm>
+                      <a:off x="0" y="0"/>
+                      <a:ext cx="5040000" cy="3736625"/>
+                    </a:xfrm>
+                    <a:prstGeom prst="rect"/>
+                  </pic:spPr>
+                </pic:pic>
+              </a:graphicData>
+            </a:graphic>
+          </wp:inline>
+        </w:drawing>
+      </w:r>
+    </w:p>
+    <w:p>
+      <w:pPr>
+        <w:spacing w:after="200"/>
+        <w:jc w:val="center"/>
+      </w:pPr>
+      <w:r>
+        <w:rPr>
+          <w:rFonts w:ascii="Times New Roman" w:hAnsi="Times New Roman"/>
+          <w:sz w:val="20"/>
+        </w:rPr>
+        <w:t>Figura 3. Importância SHAP (XGBoost, R²≈0,62): a renda média da UPA (bairro) é o principal determinante do rendimento, evidenciando o eixo territorial da desigualdade.</w:t>
       </w:r>
     </w:p>
     <w:p>
@@ -496,7 +534,7 @@
           <w:i/>
           <w:sz w:val="24"/>
         </w:rPr>
-        <w:t>Aprendizado de máquina, redes e pesquisa operacional</w:t>
+        <w:t>Camada 3 — As redes que excluem</w:t>
       </w:r>
     </w:p>
     <w:p>
@@ -505,7 +543,209 @@
         <w:jc w:val="both"/>
       </w:pPr>
       <w:r>
-        <w:t>Os modelos de aprendizado de máquina (XGBoost, R²≈0,62) corroboram, de forma não-paramétrica, o diagnóstico: o preditor mais importante do rendimento (SHAP) é a renda média do bairro, acima da escolaridade — a raça atua sobretudo por meio dos mediadores estruturais, o que é coerente com a decomposição de Oaxaca-Blinder. A SNA mostra isolamento estrutural dos grupos negros nas redes profissionais. A pesquisa operacional ranqueia 'cotas ocupacionais (CBO 1–4)' como intervenção dominante (TOPSIS CC=0,834), e a versão regionalizada mostra que focalizar o orçamento nas UFs de maior penalidade (lideradas por DF, 20,9%) rende até 68% mais redução do gap do que a alocação uniforme.</w:t>
+        <w:t>A terceira camada explica por que superar as duas primeiras ainda não basta. A análise de redes sociais mostra que os grupos negros — inclusive os de alta escolaridade — ocupam posições de maior isolamento estrutural (constraint de Burt) e betweenness próximo de zero: ficam fora das redes de indicação que convertem credenciais em oportunidades (Figura 4). Assim, o retorno do diploma negro é menor não por mérito, mas pela ausência do capital social que, historicamente, é majoritariamente branco (Granovetter, 1973; Burt, 2004). As três camadas — acesso, território e redes — reforçam-se mutuamente.</w:t>
+      </w:r>
+    </w:p>
+    <w:p>
+      <w:pPr>
+        <w:jc w:val="center"/>
+      </w:pPr>
+      <w:r>
+        <w:drawing>
+          <wp:inline xmlns:a="http://schemas.openxmlformats.org/drawingml/2006/main" xmlns:pic="http://schemas.openxmlformats.org/drawingml/2006/picture">
+            <wp:extent cx="4680000" cy="3202105"/>
+            <wp:docPr id="4" name="Picture 4"/>
+            <wp:cNvGraphicFramePr>
+              <a:graphicFrameLocks noChangeAspect="1"/>
+            </wp:cNvGraphicFramePr>
+            <a:graphic>
+              <a:graphicData uri="http://schemas.openxmlformats.org/drawingml/2006/picture">
+                <pic:pic>
+                  <pic:nvPicPr>
+                    <pic:cNvPr id="0" name="sna_constraint_vs_renda.png"/>
+                    <pic:cNvPicPr/>
+                  </pic:nvPicPr>
+                  <pic:blipFill>
+                    <a:blip r:embed="rId12"/>
+                    <a:stretch>
+                      <a:fillRect/>
+                    </a:stretch>
+                  </pic:blipFill>
+                  <pic:spPr>
+                    <a:xfrm>
+                      <a:off x="0" y="0"/>
+                      <a:ext cx="4680000" cy="3202105"/>
+                    </a:xfrm>
+                    <a:prstGeom prst="rect"/>
+                  </pic:spPr>
+                </pic:pic>
+              </a:graphicData>
+            </a:graphic>
+          </wp:inline>
+        </w:drawing>
+      </w:r>
+    </w:p>
+    <w:p>
+      <w:pPr>
+        <w:spacing w:after="200"/>
+        <w:jc w:val="center"/>
+      </w:pPr>
+      <w:r>
+        <w:rPr>
+          <w:rFonts w:ascii="Times New Roman" w:hAnsi="Times New Roman"/>
+          <w:sz w:val="20"/>
+        </w:rPr>
+        <w:t>Figura 4. Análise de redes: isolamento estrutural (constraint de Burt) × renda por grupo (raça × educação) — grupos negros combinam maior isolamento e menor renda.</w:t>
+      </w:r>
+    </w:p>
+    <w:p>
+      <w:pPr>
+        <w:spacing w:before="120"/>
+      </w:pPr>
+      <w:r>
+        <w:rPr>
+          <w:rFonts w:ascii="Times New Roman" w:hAnsi="Times New Roman"/>
+          <w:b/>
+          <w:i/>
+          <w:sz w:val="24"/>
+        </w:rPr>
+        <w:t>O caráter sistêmico: heterogeneidade geográfica, Estado e gênero</w:t>
+      </w:r>
+    </w:p>
+    <w:p>
+      <w:pPr>
+        <w:ind w:firstLine="709"/>
+        <w:jc w:val="both"/>
+      </w:pPr>
+      <w:r>
+        <w:t>Três achados confirmam que se trata de um sistema, e não de fatores avulsos. Primeiro, a discriminação é GEOGRAFICAMENTE HETEROGÊNEA: modelos de inclinação aleatória (real, via lme4 e MixedLM) rejeitam o efeito homogêneo entre estados (p&lt;0,001), tanto no acesso quanto no salário — o gap salarial racial varia entre UFs de 19,8% a 2,2% (Figura 5). Segundo, o ESTADO não dissolve a barreira: o setor público atenua o gap SALARIAL racial (7,8% vs 11,2% no privado) e o homogeneíza entre UFs, mas NÃO atenua a barreira de ACESSO (OR=0,705 vs 0,695) — o concurso equaliza a remuneração de quem entra, não a entrada. Terceiro, o GÊNERO segue padrão próprio e complementar: mulheres acessam mais ocupações qualificadas (OR=2,01) mas muito menos o topo de renda (OR=0,522) — teto de vidro de remuneração, com heterogeneidade geográfica ainda maior que a racial.</w:t>
+      </w:r>
+    </w:p>
+    <w:p>
+      <w:pPr>
+        <w:jc w:val="center"/>
+      </w:pPr>
+      <w:r>
+        <w:drawing>
+          <wp:inline xmlns:a="http://schemas.openxmlformats.org/drawingml/2006/main" xmlns:pic="http://schemas.openxmlformats.org/drawingml/2006/picture">
+            <wp:extent cx="3960000" cy="3836686"/>
+            <wp:docPr id="5" name="Picture 5"/>
+            <wp:cNvGraphicFramePr>
+              <a:graphicFrameLocks noChangeAspect="1"/>
+            </wp:cNvGraphicFramePr>
+            <a:graphic>
+              <a:graphicData uri="http://schemas.openxmlformats.org/drawingml/2006/picture">
+                <pic:pic>
+                  <pic:nvPicPr>
+                    <pic:cNvPr id="0" name="mapa_po_regional.png"/>
+                    <pic:cNvPicPr/>
+                  </pic:nvPicPr>
+                  <pic:blipFill>
+                    <a:blip r:embed="rId13"/>
+                    <a:stretch>
+                      <a:fillRect/>
+                    </a:stretch>
+                  </pic:blipFill>
+                  <pic:spPr>
+                    <a:xfrm>
+                      <a:off x="0" y="0"/>
+                      <a:ext cx="3960000" cy="3836686"/>
+                    </a:xfrm>
+                    <a:prstGeom prst="rect"/>
+                  </pic:spPr>
+                </pic:pic>
+              </a:graphicData>
+            </a:graphic>
+          </wp:inline>
+        </w:drawing>
+      </w:r>
+    </w:p>
+    <w:p>
+      <w:pPr>
+        <w:spacing w:after="200"/>
+        <w:jc w:val="center"/>
+      </w:pPr>
+      <w:r>
+        <w:rPr>
+          <w:rFonts w:ascii="Times New Roman" w:hAnsi="Times New Roman"/>
+          <w:sz w:val="20"/>
+        </w:rPr>
+        <w:t>Figura 5. Penalidade salarial racial por estado (BLUP do random slope): mais escuro = maior desvantagem; estrelas marcam as UFs prioritárias para a focalização da política.</w:t>
+      </w:r>
+    </w:p>
+    <w:p>
+      <w:pPr>
+        <w:spacing w:before="120"/>
+      </w:pPr>
+      <w:r>
+        <w:rPr>
+          <w:rFonts w:ascii="Times New Roman" w:hAnsi="Times New Roman"/>
+          <w:b/>
+          <w:i/>
+          <w:sz w:val="24"/>
+        </w:rPr>
+        <w:t>Da diagnose à prescrição: pesquisa operacional</w:t>
+      </w:r>
+    </w:p>
+    <w:p>
+      <w:pPr>
+        <w:ind w:firstLine="709"/>
+        <w:jc w:val="both"/>
+      </w:pPr>
+      <w:r>
+        <w:t>Se a desigualdade é um sistema em camadas e territorialmente desigual, a política eficaz precisa ser multidimensional e focalizada — exatamente o que a pesquisa operacional formaliza. O ranqueamento multicritério (TOPSIS) aponta as cotas de acesso a ocupações qualificadas como intervenção dominante (CC=0,834; Figura 6), coerente com o fato de a maior barreira ser de acesso. A versão regionalizada mostra, ainda, que concentrar o orçamento nas UFs de maior penalidade (lideradas por DF, 20,9%) rende até 68% mais redução do gap do que a distribuição uniforme — fechando o ciclo entre o diagnóstico das camadas e a alocação ótima de recursos.</w:t>
+      </w:r>
+    </w:p>
+    <w:p>
+      <w:pPr>
+        <w:jc w:val="center"/>
+      </w:pPr>
+      <w:r>
+        <w:drawing>
+          <wp:inline xmlns:a="http://schemas.openxmlformats.org/drawingml/2006/main" xmlns:pic="http://schemas.openxmlformats.org/drawingml/2006/picture">
+            <wp:extent cx="5400000" cy="1768591"/>
+            <wp:docPr id="6" name="Picture 6"/>
+            <wp:cNvGraphicFramePr>
+              <a:graphicFrameLocks noChangeAspect="1"/>
+            </wp:cNvGraphicFramePr>
+            <a:graphic>
+              <a:graphicData uri="http://schemas.openxmlformats.org/drawingml/2006/picture">
+                <pic:pic>
+                  <pic:nvPicPr>
+                    <pic:cNvPr id="0" name="po_politicas_topsis.png"/>
+                    <pic:cNvPicPr/>
+                  </pic:nvPicPr>
+                  <pic:blipFill>
+                    <a:blip r:embed="rId14"/>
+                    <a:stretch>
+                      <a:fillRect/>
+                    </a:stretch>
+                  </pic:blipFill>
+                  <pic:spPr>
+                    <a:xfrm>
+                      <a:off x="0" y="0"/>
+                      <a:ext cx="5400000" cy="1768591"/>
+                    </a:xfrm>
+                    <a:prstGeom prst="rect"/>
+                  </pic:spPr>
+                </pic:pic>
+              </a:graphicData>
+            </a:graphic>
+          </wp:inline>
+        </w:drawing>
+      </w:r>
+    </w:p>
+    <w:p>
+      <w:pPr>
+        <w:spacing w:after="200"/>
+        <w:jc w:val="center"/>
+      </w:pPr>
+      <w:r>
+        <w:rPr>
+          <w:rFonts w:ascii="Times New Roman" w:hAnsi="Times New Roman"/>
+          <w:sz w:val="20"/>
+        </w:rPr>
+        <w:t>Figura 6. Pesquisa operacional (TOPSIS): ranking multicritério das seis políticas; cotas de acesso a ocupações qualificadas lideram, em linha com a barreira de acesso.</w:t>
       </w:r>
     </w:p>
     <w:p>
@@ -527,7 +767,7 @@
         <w:jc w:val="both"/>
       </w:pPr>
       <w:r>
-        <w:t>Os resultados parciais sustentam que a desigualdade racial no trabalho brasileiro é um fenômeno estrutural, multicausal e territorialmente desigual, que opera em pelo menos duas etapas independentes — acesso e remuneração — e que não é dissolvido espontaneamente nem integralmente pela ação do Estado. As próximas etapas incluem o refinamento das análises de robustez e a consolidação das recomendações de política.</w:t>
+        <w:t>Tomados em conjunto, os resultados parciais convergem para a tese central: a desigualdade racial no trabalho brasileiro é um SISTEMA DE BARREIRAS EM CAMADAS — acesso, remuneração e redes — que se reforçam e têm como eixo comum o TERRITÓRIO (o bairro prediz mais que o diploma). Esse sistema persiste sob controle de escolaridade, agrava-se no topo da distribuição, varia entre estados e não é dissolvido pelo Estado, que equaliza a remuneração de quem entra, mas não o acesso. A consequência prescritiva é direta: políticas unidimensionais e uniformes são insuficientes; a pesquisa operacional indica intervenção multidimensional, centrada no acesso e focalizada nas UFs de maior penalidade. As próximas etapas incluem o refinamento das análises de robustez e a consolidação das recomendações.</w:t>
       </w:r>
     </w:p>
     <w:p>

</xml_diff>

<commit_message>
docs: adiciona hipoteses complementares do Estado (H1-H5) aos Resultados Preliminares
Nova subsecao "Hipoteses complementares: o papel ambiguo do Estado", testando a
hipotese alternativa (o Estado promove/nao dissolve a desigualdade):
- H1: setor publico reduz a desigualdade GERAL (Gini menor).
- H2/H3: publico atenua o gap racial, mas PIORA o de genero (-20,9% vs -18,6%).
- H4: pleno emprego sem prosperidade (renda real estagnada).
- H5: armadilha da qualificacao (~11% negros vs ~22% brancos), estavel.
Sintese: o Estado mitiga a desigualdade geral, nao a racial — sustenta
parcialmente a hipotese alternativa e reforca a tese do sistema em camadas.
Figura 6 (estado_h2h3_gaps); TOPSIS renumerado para Figura 7. 7 figuras no total.

Co-Authored-By: Claude Opus 4.8 <noreply@anthropic.com>
</commit_message>
<xml_diff>
--- a/Resultados_Preliminares_TCC.docx
+++ b/Resultados_Preliminares_TCC.docx
@@ -684,6 +684,81 @@
           <w:i/>
           <w:sz w:val="24"/>
         </w:rPr>
+        <w:t>Hipóteses complementares: o papel ambíguo do Estado</w:t>
+      </w:r>
+    </w:p>
+    <w:p>
+      <w:pPr>
+        <w:ind w:firstLine="709"/>
+        <w:jc w:val="both"/>
+      </w:pPr>
+      <w:r>
+        <w:t>Um conjunto de hipóteses adicionais testa diretamente a hipótese alternativa de que o Estado promoveria — ou, ao menos, não dissolveria — a desigualdade racial. Os resultados são ambíguos e refinam a tese central. Como indutor de igualdade GERAL, o Estado funciona: o setor público reduz levemente a desigualdade de renda (índice de Gini inferior ao do privado; H1). Mas como dissolvente da barreira RACIAL, não: embora o público atenue o gap racial (H2, Figura 6) — coerente com a camada sistêmica anterior —, ele PIORA o gap de gênero (−20,9% no público contra −18,6% no privado; H3): o concurso equaliza a entrada, mas a promoção às posições de liderança reflete, ou amplifica, os vieses do setor privado. No agregado (H4), o país combina pleno emprego histórico com renda real estagnada — produz ocupação, não prosperidade igualitária. E a armadilha da qualificação persiste (H5): a proporção de trabalhadores negros em ocupações de alta qualificação (≈11%) é cerca de metade da de brancos (≈22%), gap estável na década. Em síntese, o Estado mitiga a desigualdade GERAL, mas não a RACIAL — sustentando parcialmente a hipótese alternativa e reforçando o caráter sistêmico do problema.</w:t>
+      </w:r>
+    </w:p>
+    <w:p>
+      <w:pPr>
+        <w:jc w:val="center"/>
+      </w:pPr>
+      <w:r>
+        <w:drawing>
+          <wp:inline xmlns:a="http://schemas.openxmlformats.org/drawingml/2006/main" xmlns:pic="http://schemas.openxmlformats.org/drawingml/2006/picture">
+            <wp:extent cx="5400000" cy="2275595"/>
+            <wp:docPr id="6" name="Picture 6"/>
+            <wp:cNvGraphicFramePr>
+              <a:graphicFrameLocks noChangeAspect="1"/>
+            </wp:cNvGraphicFramePr>
+            <a:graphic>
+              <a:graphicData uri="http://schemas.openxmlformats.org/drawingml/2006/picture">
+                <pic:pic>
+                  <pic:nvPicPr>
+                    <pic:cNvPr id="0" name="estado_h2h3_gaps.png"/>
+                    <pic:cNvPicPr/>
+                  </pic:nvPicPr>
+                  <pic:blipFill>
+                    <a:blip r:embed="rId14"/>
+                    <a:stretch>
+                      <a:fillRect/>
+                    </a:stretch>
+                  </pic:blipFill>
+                  <pic:spPr>
+                    <a:xfrm>
+                      <a:off x="0" y="0"/>
+                      <a:ext cx="5400000" cy="2275595"/>
+                    </a:xfrm>
+                    <a:prstGeom prst="rect"/>
+                  </pic:spPr>
+                </pic:pic>
+              </a:graphicData>
+            </a:graphic>
+          </wp:inline>
+        </w:drawing>
+      </w:r>
+    </w:p>
+    <w:p>
+      <w:pPr>
+        <w:spacing w:after="200"/>
+        <w:jc w:val="center"/>
+      </w:pPr>
+      <w:r>
+        <w:rPr>
+          <w:rFonts w:ascii="Times New Roman" w:hAnsi="Times New Roman"/>
+          <w:sz w:val="20"/>
+        </w:rPr>
+        <w:t>Figura 6. Hipóteses do Estado (H2/H3): gap racial e de gênero por setor (gaps controlados) — o público atenua o racial, mas agrava o de gênero.</w:t>
+      </w:r>
+    </w:p>
+    <w:p>
+      <w:pPr>
+        <w:spacing w:before="120"/>
+      </w:pPr>
+      <w:r>
+        <w:rPr>
+          <w:rFonts w:ascii="Times New Roman" w:hAnsi="Times New Roman"/>
+          <w:b/>
+          <w:i/>
+          <w:sz w:val="24"/>
+        </w:rPr>
         <w:t>Da diagnose à prescrição: pesquisa operacional</w:t>
       </w:r>
     </w:p>
@@ -693,7 +768,7 @@
         <w:jc w:val="both"/>
       </w:pPr>
       <w:r>
-        <w:t>Se a desigualdade é um sistema em camadas e territorialmente desigual, a política eficaz precisa ser multidimensional e focalizada — exatamente o que a pesquisa operacional formaliza. O ranqueamento multicritério (TOPSIS) aponta as cotas de acesso a ocupações qualificadas como intervenção dominante (CC=0,834; Figura 6), coerente com o fato de a maior barreira ser de acesso. A versão regionalizada mostra, ainda, que concentrar o orçamento nas UFs de maior penalidade (lideradas por DF, 20,9%) rende até 68% mais redução do gap do que a distribuição uniforme — fechando o ciclo entre o diagnóstico das camadas e a alocação ótima de recursos.</w:t>
+        <w:t>Se a desigualdade é um sistema em camadas e territorialmente desigual, a política eficaz precisa ser multidimensional e focalizada — exatamente o que a pesquisa operacional formaliza. O ranqueamento multicritério (TOPSIS) aponta as cotas de acesso a ocupações qualificadas como intervenção dominante (CC=0,834; Figura 7), coerente com o fato de a maior barreira ser de acesso. A versão regionalizada mostra, ainda, que concentrar o orçamento nas UFs de maior penalidade (lideradas por DF, 20,9%) rende até 68% mais redução do gap do que a distribuição uniforme — fechando o ciclo entre o diagnóstico das camadas e a alocação ótima de recursos.</w:t>
       </w:r>
     </w:p>
     <w:p>
@@ -704,7 +779,7 @@
         <w:drawing>
           <wp:inline xmlns:a="http://schemas.openxmlformats.org/drawingml/2006/main" xmlns:pic="http://schemas.openxmlformats.org/drawingml/2006/picture">
             <wp:extent cx="5400000" cy="1768591"/>
-            <wp:docPr id="6" name="Picture 6"/>
+            <wp:docPr id="7" name="Picture 7"/>
             <wp:cNvGraphicFramePr>
               <a:graphicFrameLocks noChangeAspect="1"/>
             </wp:cNvGraphicFramePr>
@@ -716,7 +791,7 @@
                     <pic:cNvPicPr/>
                   </pic:nvPicPr>
                   <pic:blipFill>
-                    <a:blip r:embed="rId14"/>
+                    <a:blip r:embed="rId15"/>
                     <a:stretch>
                       <a:fillRect/>
                     </a:stretch>
@@ -745,7 +820,7 @@
           <w:rFonts w:ascii="Times New Roman" w:hAnsi="Times New Roman"/>
           <w:sz w:val="20"/>
         </w:rPr>
-        <w:t>Figura 6. Pesquisa operacional (TOPSIS): ranking multicritério das seis políticas; cotas de acesso a ocupações qualificadas lideram, em linha com a barreira de acesso.</w:t>
+        <w:t>Figura 7. Pesquisa operacional (TOPSIS): ranking multicritério das seis políticas; cotas de acesso a ocupações qualificadas lideram, em linha com a barreira de acesso.</w:t>
       </w:r>
     </w:p>
     <w:p>

</xml_diff>

<commit_message>
docs: preenche nome do orientador (Edilson José Rodrigues)
Substitui o placeholder do orientador no documento de Resultados Preliminares
(linha de autores + nota de rodape) e na capa da apresentacao tecnica.

Co-Authored-By: Claude Opus 4.8 <noreply@anthropic.com>
</commit_message>
<xml_diff>
--- a/Resultados_Preliminares_TCC.docx
+++ b/Resultados_Preliminares_TCC.docx
@@ -27,7 +27,7 @@
           <w:i w:val="0"/>
           <w:sz w:val="24"/>
         </w:rPr>
-        <w:t>Ricardo Calheiros¹*; [Nome completo do(a) orientador(a)]²</w:t>
+        <w:t>Ricardo Calheiros¹*; Edilson José Rodrigues²</w:t>
       </w:r>
     </w:p>
     <w:p>
@@ -55,7 +55,7 @@
           <w:i w:val="0"/>
           <w:sz w:val="20"/>
         </w:rPr>
-        <w:t>² Titulação. Instituição (opcional). E-mail: orientador@email.com</w:t>
+        <w:t>² Orientador. MBA USP/Esalq.</w:t>
       </w:r>
     </w:p>
     <w:p/>

</xml_diff>

<commit_message>
feat: contexto macro IBGE (POF + Gini 2025) na introducao e discussao
Incorpora dois contextos recentes do IBGE como pano de fundo da tese:
A) POF 2017-2018: qualidade de vida melhorou (~30% no IPQV) mas o gap racial
   (chefes pretos/pardos 0,183 vs brancos 0,122) e territorial (Norte/Nordeste
   vs Sul) persiste — corrobora "progresso agregado que nao fecha o hiato racial".
B) PNAD Rendimento de Todas as Fontes 2025: Gini domiciliar per capita subiu
   0,487->0,491, puxado pelo topo (10% ricos +8,7% vs 10% pobres +3,1%).

Inclui ressalva metodologica (Gini do trabalho entre ocupados ~0,48 != Gini
domiciliar per capita do IBGE) e gancho territorial (DF: maior renda per capita
e maior penalidade racial). Referencias IBGE (POF 2017-2018; Rend. Todas as
Fontes 2025) no relatorio (.tex/Word) e prelim. Tambem corrige 2 literais OB
(16,0/84,0 -> params 16,2/83,8). Validador verde; PDF 31 pp.

Co-Authored-By: Claude Opus 4.8 <noreply@anthropic.com>
</commit_message>
<xml_diff>
--- a/Resultados_Preliminares_TCC.docx
+++ b/Resultados_Preliminares_TCC.docx
@@ -119,6 +119,15 @@
       </w:pPr>
       <w:r>
         <w:t>A persistência da desigualdade racial no mercado de trabalho brasileiro é um dos fenômenos mais documentados das ciências sociais nacionais, desde a tese do preconceito estrutural de Hasenbalg (1979) até as decomposições contemporâneas do rendimento (Henriques, 2001; Soares, 2009). Apesar do avanço educacional das últimas décadas, trabalhadores negros seguem auferindo rendimentos inferiores e ocupando, em menor proporção, as posições de maior prestígio e remuneração — um padrão que a explicação meritocrática, baseada apenas em capital humano, não dá conta de prever.</w:t>
+      </w:r>
+    </w:p>
+    <w:p>
+      <w:pPr>
+        <w:ind w:firstLine="709"/>
+        <w:jc w:val="both"/>
+      </w:pPr>
+      <w:r>
+        <w:t>Esse hiato convive com um quadro recente de avanço social com desigualdade persistente: a Pesquisa de Orçamentos Familiares (POF) do IBGE registra melhora ampla na qualidade de vida entre 2008 e 2018 (queda de ~30% no Índice de Perda de Qualidade de Vida), mas sem fechar o gap racial (chefes pretos/pardos 0,183 vs. brancos 0,122) nem o territorial (Norte 0,223 / Nordeste 0,207 vs. Sul 0,114; IBGE, POF 2017–2018). No rendimento, o Gini domiciliar per capita voltou a subir em 2025 (0,491, ante 0,487 em 2024), puxado pelo topo (IBGE/PNAD Contínua, 2025). É esse padrão — progresso agregado que não dissolve a barreira racial — que este trabalho disseca no mercado de trabalho.</w:t>
       </w:r>
     </w:p>
     <w:p>
@@ -393,7 +402,7 @@
         <w:jc w:val="both"/>
       </w:pPr>
       <w:r>
-        <w:t>A primeira camada é a exclusão da PORTA DE ENTRADA. O GLMM logístico multinível estima que um trabalhador negro idêntico a um branco tem cerca de 31% menos chance de ocupar um cargo qualificado (OR=0,693; −4,75 p.p.). A barreira não é uniforme ao longo da hierarquia: ela se agrava no topo (Figura 2) — o odds ratio de acesso cai de 0,540 no quintil superior de renda para 0,457 no decil superior. É um teto de vidro de ACESSO: quanto mais valiosa a posição, mais opaco o filtro racial. O elevado ICC de UPA (21,6%) já antecipa que essa barreira tem raiz territorial — o fio que conecta as camadas.</w:t>
+        <w:t>A primeira camada é a exclusão da PORTA DE ENTRADA. O GLMM logístico multinível estima que um trabalhador negro idêntico a um branco tem cerca de 31% menos chance de ocupar um cargo qualificado (OR=0,693; −4,73 p.p.). A barreira não é uniforme ao longo da hierarquia: ela se agrava no topo (Figura 2) — o odds ratio de acesso cai de 0,540 no quintil superior de renda para 0,457 no decil superior. É um teto de vidro de ACESSO: quanto mais valiosa a posição, mais opaco o filtro racial. O elevado ICC de UPA (21,6%) já antecipa que essa barreira tem raiz territorial — o fio que conecta as camadas.</w:t>
       </w:r>
     </w:p>
     <w:p>
@@ -1012,7 +1021,31 @@
         <w:rPr>
           <w:sz w:val="22"/>
         </w:rPr>
+        <w:t>INSTITUTO BRASILEIRO DE GEOGRAFIA E ESTATÍSTICA (IBGE). PNAD Contínua: Rendimento de Todas as Fontes 2025. Rio de Janeiro: IBGE, 2025.</w:t>
+      </w:r>
+    </w:p>
+    <w:p>
+      <w:pPr>
+        <w:spacing w:after="120" w:line="240" w:lineRule="auto"/>
+        <w:jc w:val="both"/>
+      </w:pPr>
+      <w:r>
+        <w:rPr>
+          <w:sz w:val="22"/>
+        </w:rPr>
         <w:t>INSTITUTO BRASILEIRO DE GEOGRAFIA E ESTATÍSTICA (IBGE). Pesquisa Nacional por Amostra de Domicílios Contínua. Rio de Janeiro: IBGE, 2016-2025.</w:t>
+      </w:r>
+    </w:p>
+    <w:p>
+      <w:pPr>
+        <w:spacing w:after="120" w:line="240" w:lineRule="auto"/>
+        <w:jc w:val="both"/>
+      </w:pPr>
+      <w:r>
+        <w:rPr>
+          <w:sz w:val="22"/>
+        </w:rPr>
+        <w:t>INSTITUTO BRASILEIRO DE GEOGRAFIA E ESTATÍSTICA (IBGE). Pesquisa de Orçamentos Familiares 2017-2018: análise da qualidade de vida. Rio de Janeiro: IBGE, 2019.</w:t>
       </w:r>
     </w:p>
     <w:p>

</xml_diff>

<commit_message>
fix(pericia): trata os 3 achados — base ICC, clustering, IPS+Gini intra-raca
1. ICC baseline: remove literais nao-verificaveis 26,2%/22,2% (Word), mantendo
   valores atuais sourced + ponto qualitativo (cobertura completa reduz o ICC).
2. Clustering: corrige docstring (alegacao falsa de "100% cobertura") e documenta
   por que educ_missing NAO entra no k-means (flag de ausencia criaria artefato;
   e device de regressao, nao feature descritiva). Sem re-run (IDs nao relabelados).
3. IPS + Gini intra-raca incorporados:
   - IPS: paragrafo na camada territorial do prelim (corroboracao externa).
   - Gini intra-raca: novo run_gini_raca.py (ponderado V1028) -> brancos 0,485 >
     negros 0,449 (efeito-chao, nao equidade); figura gini_raca.png; params GINI_*;
     paragrafos no prelim (Fig 2c) e na Discussao do relatorio.
Validador verde; PDF 32 pp.

Co-Authored-By: Claude Opus 4.8 <noreply@anthropic.com>
</commit_message>
<xml_diff>
--- a/Resultados_Preliminares_TCC.docx
+++ b/Resultados_Preliminares_TCC.docx
@@ -520,6 +520,67 @@
     </w:p>
     <w:p>
       <w:pPr>
+        <w:ind w:firstLine="709"/>
+        <w:jc w:val="both"/>
+      </w:pPr>
+      <w:r>
+        <w:t>Um indicador distribucional reforça o teto de vidro. O Gini da renda do trabalho é MAIOR entre brancos (0,485) do que entre negros (0,449) — em todos os anos da série. Isso não é equidade entre negros: é CONFINAMENTO AO PISO (renda homogeneamente baixa), o reverso distribucional da barreira de acesso ao topo. Quem é barrado do topo achata-se na base. Cabe a ressalva de que este Gini refere-se ao rendimento do TRABALHO entre ocupados — conceito distinto do Gini domiciliar per capita do IBGE (Figura 2c).</w:t>
+      </w:r>
+    </w:p>
+    <w:p>
+      <w:pPr>
+        <w:jc w:val="center"/>
+      </w:pPr>
+      <w:r>
+        <w:drawing>
+          <wp:inline xmlns:a="http://schemas.openxmlformats.org/drawingml/2006/main" xmlns:pic="http://schemas.openxmlformats.org/drawingml/2006/picture">
+            <wp:extent cx="4680000" cy="2764720"/>
+            <wp:docPr id="4" name="Picture 4"/>
+            <wp:cNvGraphicFramePr>
+              <a:graphicFrameLocks noChangeAspect="1"/>
+            </wp:cNvGraphicFramePr>
+            <a:graphic>
+              <a:graphicData uri="http://schemas.openxmlformats.org/drawingml/2006/picture">
+                <pic:pic>
+                  <pic:nvPicPr>
+                    <pic:cNvPr id="0" name="gini_raca.png"/>
+                    <pic:cNvPicPr/>
+                  </pic:nvPicPr>
+                  <pic:blipFill>
+                    <a:blip r:embed="rId12"/>
+                    <a:stretch>
+                      <a:fillRect/>
+                    </a:stretch>
+                  </pic:blipFill>
+                  <pic:spPr>
+                    <a:xfrm>
+                      <a:off x="0" y="0"/>
+                      <a:ext cx="4680000" cy="2764720"/>
+                    </a:xfrm>
+                    <a:prstGeom prst="rect"/>
+                  </pic:spPr>
+                </pic:pic>
+              </a:graphicData>
+            </a:graphic>
+          </wp:inline>
+        </w:drawing>
+      </w:r>
+    </w:p>
+    <w:p>
+      <w:pPr>
+        <w:spacing w:after="200"/>
+        <w:jc w:val="center"/>
+      </w:pPr>
+      <w:r>
+        <w:rPr>
+          <w:rFonts w:ascii="Times New Roman" w:hAnsi="Times New Roman"/>
+          <w:sz w:val="20"/>
+        </w:rPr>
+        <w:t>Figura 2c. Gini intra-raça (renda do trabalho, ponderado): brancos têm maior desigualdade interna; negros, comprimidos no piso — o reverso do teto de vidro, não equidade.</w:t>
+      </w:r>
+    </w:p>
+    <w:p>
+      <w:pPr>
         <w:spacing w:before="120"/>
       </w:pPr>
       <w:r>
@@ -549,7 +610,7 @@
         <w:drawing>
           <wp:inline xmlns:a="http://schemas.openxmlformats.org/drawingml/2006/main" xmlns:pic="http://schemas.openxmlformats.org/drawingml/2006/picture">
             <wp:extent cx="5040000" cy="3736625"/>
-            <wp:docPr id="4" name="Picture 4"/>
+            <wp:docPr id="5" name="Picture 5"/>
             <wp:cNvGraphicFramePr>
               <a:graphicFrameLocks noChangeAspect="1"/>
             </wp:cNvGraphicFramePr>
@@ -561,7 +622,7 @@
                     <pic:cNvPicPr/>
                   </pic:nvPicPr>
                   <pic:blipFill>
-                    <a:blip r:embed="rId12"/>
+                    <a:blip r:embed="rId13"/>
                     <a:stretch>
                       <a:fillRect/>
                     </a:stretch>
@@ -595,6 +656,15 @@
     </w:p>
     <w:p>
       <w:pPr>
+        <w:ind w:firstLine="709"/>
+        <w:jc w:val="both"/>
+      </w:pPr>
+      <w:r>
+        <w:t>Esse eixo territorial encontra corroboração externa no Índice de Progresso Social (IPS) municipal (Imazon e parceiros, 2026): as regiões de menor progresso social (Norte e Nordeste) coincidem com as de maior penalidade racial em nossos modelos. Ressalva metodológica: a integração fina com o proxy de bairro (UPA) é inviável — a PNAD não divulga o município e o IPS é municipal, mais agregado que a UPA —, de modo que o IPS entra como evidência convergente do caráter territorial, não como fonte de dados integrada.</w:t>
+      </w:r>
+    </w:p>
+    <w:p>
+      <w:pPr>
         <w:spacing w:before="120"/>
       </w:pPr>
       <w:r>
@@ -624,7 +694,7 @@
         <w:drawing>
           <wp:inline xmlns:a="http://schemas.openxmlformats.org/drawingml/2006/main" xmlns:pic="http://schemas.openxmlformats.org/drawingml/2006/picture">
             <wp:extent cx="4680000" cy="3202105"/>
-            <wp:docPr id="5" name="Picture 5"/>
+            <wp:docPr id="6" name="Picture 6"/>
             <wp:cNvGraphicFramePr>
               <a:graphicFrameLocks noChangeAspect="1"/>
             </wp:cNvGraphicFramePr>
@@ -636,7 +706,7 @@
                     <pic:cNvPicPr/>
                   </pic:nvPicPr>
                   <pic:blipFill>
-                    <a:blip r:embed="rId13"/>
+                    <a:blip r:embed="rId14"/>
                     <a:stretch>
                       <a:fillRect/>
                     </a:stretch>
@@ -699,7 +769,7 @@
         <w:drawing>
           <wp:inline xmlns:a="http://schemas.openxmlformats.org/drawingml/2006/main" xmlns:pic="http://schemas.openxmlformats.org/drawingml/2006/picture">
             <wp:extent cx="3960000" cy="3836686"/>
-            <wp:docPr id="6" name="Picture 6"/>
+            <wp:docPr id="7" name="Picture 7"/>
             <wp:cNvGraphicFramePr>
               <a:graphicFrameLocks noChangeAspect="1"/>
             </wp:cNvGraphicFramePr>
@@ -711,7 +781,7 @@
                     <pic:cNvPicPr/>
                   </pic:nvPicPr>
                   <pic:blipFill>
-                    <a:blip r:embed="rId14"/>
+                    <a:blip r:embed="rId15"/>
                     <a:stretch>
                       <a:fillRect/>
                     </a:stretch>
@@ -774,7 +844,7 @@
         <w:drawing>
           <wp:inline xmlns:a="http://schemas.openxmlformats.org/drawingml/2006/main" xmlns:pic="http://schemas.openxmlformats.org/drawingml/2006/picture">
             <wp:extent cx="5400000" cy="2275595"/>
-            <wp:docPr id="7" name="Picture 7"/>
+            <wp:docPr id="8" name="Picture 8"/>
             <wp:cNvGraphicFramePr>
               <a:graphicFrameLocks noChangeAspect="1"/>
             </wp:cNvGraphicFramePr>
@@ -786,7 +856,7 @@
                     <pic:cNvPicPr/>
                   </pic:nvPicPr>
                   <pic:blipFill>
-                    <a:blip r:embed="rId15"/>
+                    <a:blip r:embed="rId16"/>
                     <a:stretch>
                       <a:fillRect/>
                     </a:stretch>
@@ -849,7 +919,7 @@
         <w:drawing>
           <wp:inline xmlns:a="http://schemas.openxmlformats.org/drawingml/2006/main" xmlns:pic="http://schemas.openxmlformats.org/drawingml/2006/picture">
             <wp:extent cx="5400000" cy="1768591"/>
-            <wp:docPr id="8" name="Picture 8"/>
+            <wp:docPr id="9" name="Picture 9"/>
             <wp:cNvGraphicFramePr>
               <a:graphicFrameLocks noChangeAspect="1"/>
             </wp:cNvGraphicFramePr>
@@ -861,7 +931,7 @@
                     <pic:cNvPicPr/>
                   </pic:nvPicPr>
                   <pic:blipFill>
-                    <a:blip r:embed="rId16"/>
+                    <a:blip r:embed="rId17"/>
                     <a:stretch>
                       <a:fillRect/>
                     </a:stretch>

</xml_diff>